<commit_message>
Add architecture diagram and image-ready report generator
- docs/screenshots/architecture.png: full system architecture diagram
  (matplotlib) showing Muse 2 -> BrainFlow -> Python Backend ->
  WebSocket -> ESP32 -> WS2812B matrix, plus React dashboard branch
  and pattern routing table. Dark Sentio theme.

- generate_architecture_diagram.py: reproducible script for the diagram.

- generate_report.py: updated to embed architecture.png + 5 UI
  screenshots at the correct positions in the report. Falls back to
  grey placeholder text if a screenshot file is missing. Run after
  saving screenshots to docs/screenshots/ with names:
    01_config_screen.png  02_device_settings.png
    03_calibration_screen.png  04_signal_lost.png
    05_monitoring_screen.png

- docs/sentio_critical_report.docx: regenerated with architecture
  diagram and placeholder captions for the 5 UI screenshots.

Co-Authored-By: Claude Sonnet 4.6 <noreply@anthropic.com>
</commit_message>
<xml_diff>
--- a/docs/sentio_critical_report.docx
+++ b/docs/sentio_critical_report.docx
@@ -47,7 +47,86 @@
           <w:color w:val="828282"/>
           <w:sz w:val="20"/>
         </w:rPr>
-        <w:t>Sentio Project  ·  WS2812B Arduino Version  ·  2026</w:t>
+        <w:t>Sentio Project  |  WS2812B Arduino Version  |  2026</w:t>
+      </w:r>
+    </w:p>
+    <w:p>
+      <w:pPr>
+        <w:spacing w:after="40" w:before="40"/>
+        <w:pBdr>
+          <w:bottom w:val="single" w:sz="6" w:space="1" w:color="AAAAAA"/>
+        </w:pBdr>
+      </w:pPr>
+    </w:p>
+    <w:p>
+      <w:pPr>
+        <w:keepNext/>
+        <w:spacing w:before="360" w:after="80"/>
+      </w:pPr>
+      <w:r>
+        <w:rPr>
+          <w:rFonts w:ascii="Times New Roman" w:hAnsi="Times New Roman"/>
+          <w:b/>
+          <w:i w:val="0"/>
+          <w:sz w:val="26"/>
+        </w:rPr>
+        <w:t>System Architecture</w:t>
+      </w:r>
+    </w:p>
+    <w:p>
+      <w:pPr>
+        <w:spacing w:before="240" w:after="80"/>
+        <w:jc w:val="center"/>
+      </w:pPr>
+      <w:r>
+        <w:drawing>
+          <wp:inline xmlns:a="http://schemas.openxmlformats.org/drawingml/2006/main" xmlns:pic="http://schemas.openxmlformats.org/drawingml/2006/picture">
+            <wp:extent cx="5486400" cy="3107575"/>
+            <wp:docPr id="1" name="Picture 1"/>
+            <wp:cNvGraphicFramePr>
+              <a:graphicFrameLocks noChangeAspect="1"/>
+            </wp:cNvGraphicFramePr>
+            <a:graphic>
+              <a:graphicData uri="http://schemas.openxmlformats.org/drawingml/2006/picture">
+                <pic:pic>
+                  <pic:nvPicPr>
+                    <pic:cNvPr id="0" name="architecture.png"/>
+                    <pic:cNvPicPr/>
+                  </pic:nvPicPr>
+                  <pic:blipFill>
+                    <a:blip r:embed="rId9"/>
+                    <a:stretch>
+                      <a:fillRect/>
+                    </a:stretch>
+                  </pic:blipFill>
+                  <pic:spPr>
+                    <a:xfrm>
+                      <a:off x="0" y="0"/>
+                      <a:ext cx="5486400" cy="3107575"/>
+                    </a:xfrm>
+                    <a:prstGeom prst="rect"/>
+                  </pic:spPr>
+                </pic:pic>
+              </a:graphicData>
+            </a:graphic>
+          </wp:inline>
+        </w:drawing>
+      </w:r>
+    </w:p>
+    <w:p>
+      <w:pPr>
+        <w:spacing w:after="280" w:before="40"/>
+        <w:jc w:val="center"/>
+      </w:pPr>
+      <w:r>
+        <w:rPr>
+          <w:rFonts w:ascii="Times New Roman" w:hAnsi="Times New Roman"/>
+          <w:b w:val="0"/>
+          <w:i/>
+          <w:color w:val="646464"/>
+          <w:sz w:val="18"/>
+        </w:rPr>
+        <w:t>Figure 0 — Sentio system architecture: Muse 2 headband to WS2812B LED matrix via ESP32 WebSocket, with React monitoring dashboard as secondary output.</w:t>
       </w:r>
     </w:p>
     <w:p>
@@ -85,7 +164,39 @@
           <w:i w:val="0"/>
           <w:sz w:val="24"/>
         </w:rPr>
-        <w:t>Sentio is an emotion-driven wearable interactive system that translates real-time electroencephalography (EEG) data into generative visual patterns rendered on a 16×16 WS2812B LED matrix embedded in a t-shirt. A Muse 2 headband captures brainwave activity; a Python backend classifies five emotional states — calm, focused, stressed, relaxed, and excited — and streams results wirelessly via WebSocket to an ESP32 microcontroller, which drives 256 individually addressable LEDs through four distinct visual patterns: Ondas Fluidas, Padrão Geométrico, Pulsos Rítmicos, and Estrelas e Partículas. This report critically evaluates Sentio's effectiveness as an interactive system, examining usability, interaction design principles, and system-level thinking to assess how successfully it bridges complex neurological data and a meaningful wearable experience.</w:t>
+        <w:t>Sentio is an emotion-driven wearable interactive system that translates real-time electroencephalography (EEG) data into generative visual patterns rendered on a 16x16 WS2812B LED matrix embedded in a t-shirt. A Muse 2 headband captures brainwave activity; a Python backend classifies five emotional states -- calm, focused, stressed, relaxed, and excited -- and streams results wirelessly via WebSocket to an ESP32 microcontroller, which drives 256 individually addressable LEDs through four distinct visual patterns: Ondas Fluidas, Padrao Geometrico, Pulsos Ritmicos, and Estrelas e Particulas. The system also provides a React web dashboard (Figure 5) for real-time monitoring by operators. This report critically evaluates Sentio's effectiveness as an interactive system, examining usability, interaction design principles, and system-level thinking to assess how successfully it bridges complex neurological data and a meaningful wearable experience.</w:t>
+      </w:r>
+    </w:p>
+    <w:p>
+      <w:pPr>
+        <w:spacing w:before="160" w:after="80"/>
+        <w:jc w:val="center"/>
+      </w:pPr>
+      <w:r>
+        <w:rPr>
+          <w:rFonts w:ascii="Times New Roman" w:hAnsi="Times New Roman"/>
+          <w:b w:val="0"/>
+          <w:i/>
+          <w:color w:val="A0A0A0"/>
+          <w:sz w:val="20"/>
+        </w:rPr>
+        <w:t>[Image not found: 01_config_screen.png]</w:t>
+      </w:r>
+    </w:p>
+    <w:p>
+      <w:pPr>
+        <w:spacing w:after="280" w:before="40"/>
+        <w:jc w:val="center"/>
+      </w:pPr>
+      <w:r>
+        <w:rPr>
+          <w:rFonts w:ascii="Times New Roman" w:hAnsi="Times New Roman"/>
+          <w:b w:val="0"/>
+          <w:i/>
+          <w:color w:val="646464"/>
+          <w:sz w:val="18"/>
+        </w:rPr>
+        <w:t>Figure 1 — Configuration screen: pattern type selection and signal sensitivity slider.</w:t>
       </w:r>
     </w:p>
     <w:p>
@@ -124,7 +235,25 @@
           <w:i w:val="0"/>
           <w:sz w:val="24"/>
         </w:rPr>
-        <w:t>Sentio achieves its primary goal — transforming EEG input into visible wearable output — through a clearly defined five-stage pipeline: session configuration, device connection, calibration, real-time monitoring, and LED pattern output. This sequential structure supports task completion by eliminating ambiguity about system state at each stage. However, effectiveness is contingent on hardware reliability: Bluetooth connectivity between the Muse headband and the processing machine constitutes a single point of failure capable of preventing task completion entirely, a structural vulnerability that the interface does not adequately communicate to users.</w:t>
+        <w:t xml:space="preserve">Sentio achieves its primary goal through a clearly defined five-stage pipeline: session configuration, device connection, calibration, real-time monitoring, and LED pattern output (Figures 1-3). The configuration screen (Figure 1) presents pattern type as a 2x2 card grid with inline SVG previews, reducing the abstraction gap between label and output. This design decision supports task completion by providing </w:t>
+      </w:r>
+      <w:r>
+        <w:rPr>
+          <w:rFonts w:ascii="Times New Roman" w:hAnsi="Times New Roman"/>
+          <w:b w:val="0"/>
+          <w:i/>
+          <w:sz w:val="24"/>
+        </w:rPr>
+        <w:t>recognition over recall</w:t>
+      </w:r>
+      <w:r>
+        <w:rPr>
+          <w:rFonts w:ascii="Times New Roman" w:hAnsi="Times New Roman"/>
+          <w:b w:val="0"/>
+          <w:i w:val="0"/>
+          <w:sz w:val="24"/>
+        </w:rPr>
+        <w:t xml:space="preserve"> (Nielsen, 1994). However, effectiveness is contingent on hardware reliability: Bluetooth connectivity between the Muse headband and the processing machine constitutes a single point of failure capable of preventing task completion entirely.</w:t>
       </w:r>
     </w:p>
     <w:p>
@@ -148,25 +277,7 @@
           <w:i w:val="0"/>
           <w:sz w:val="24"/>
         </w:rPr>
-        <w:t xml:space="preserve">The onboarding flow (configuration → calibration → monitoring) reduces cognitive overhead by guiding users through each stage, aligning with Nielsen's heuristic of </w:t>
-      </w:r>
-      <w:r>
-        <w:rPr>
-          <w:rFonts w:ascii="Times New Roman" w:hAnsi="Times New Roman"/>
-          <w:b w:val="0"/>
-          <w:i/>
-          <w:sz w:val="24"/>
-        </w:rPr>
-        <w:t>recognition over recall</w:t>
-      </w:r>
-      <w:r>
-        <w:rPr>
-          <w:rFonts w:ascii="Times New Roman" w:hAnsi="Times New Roman"/>
-          <w:b w:val="0"/>
-          <w:i w:val="0"/>
-          <w:sz w:val="24"/>
-        </w:rPr>
-        <w:t xml:space="preserve"> (Nielsen, 1994). Calibration completes automatically, requiring no active user input — a deliberate affordance constraint that minimises error opportunity. However, efficiency is undermined by the calibration stage's opacity: the animated progress bar runs independently of actual backend processing, meaning users cannot distinguish genuine device communication from a cosmetic animation. This violates Nielsen's </w:t>
+        <w:t xml:space="preserve">The Device Settings panel (Figure 2) allows operators to configure the backend API URL and Muse MAC address without redeploying the application -- a pragmatic field-deployment affordance. Calibration (Figure 3) completes automatically, requiring no active user input. However, efficiency is undermined by the calibration stage's opacity: the animated progress bar runs independently of actual backend processing, meaning users cannot distinguish genuine device communication from a cosmetic animation. This violates Nielsen's </w:t>
       </w:r>
       <w:r>
         <w:rPr>
@@ -184,7 +295,71 @@
           <w:i w:val="0"/>
           <w:sz w:val="24"/>
         </w:rPr>
-        <w:t xml:space="preserve"> heuristic and erodes trust, particularly for technically literate users.</w:t>
+        <w:t xml:space="preserve"> heuristic and erodes trust with technically literate users.</w:t>
+      </w:r>
+    </w:p>
+    <w:p>
+      <w:pPr>
+        <w:spacing w:before="160" w:after="80"/>
+        <w:jc w:val="center"/>
+      </w:pPr>
+      <w:r>
+        <w:rPr>
+          <w:rFonts w:ascii="Times New Roman" w:hAnsi="Times New Roman"/>
+          <w:b w:val="0"/>
+          <w:i/>
+          <w:color w:val="A0A0A0"/>
+          <w:sz w:val="20"/>
+        </w:rPr>
+        <w:t>[Image not found: 02_device_settings.png]</w:t>
+      </w:r>
+    </w:p>
+    <w:p>
+      <w:pPr>
+        <w:spacing w:after="280" w:before="40"/>
+        <w:jc w:val="center"/>
+      </w:pPr>
+      <w:r>
+        <w:rPr>
+          <w:rFonts w:ascii="Times New Roman" w:hAnsi="Times New Roman"/>
+          <w:b w:val="0"/>
+          <w:i/>
+          <w:color w:val="646464"/>
+          <w:sz w:val="18"/>
+        </w:rPr>
+        <w:t>Figure 2 — Device Settings panel: backend API URL and Muse 2 MAC address configuration.</w:t>
+      </w:r>
+    </w:p>
+    <w:p>
+      <w:pPr>
+        <w:spacing w:before="160" w:after="80"/>
+        <w:jc w:val="center"/>
+      </w:pPr>
+      <w:r>
+        <w:rPr>
+          <w:rFonts w:ascii="Times New Roman" w:hAnsi="Times New Roman"/>
+          <w:b w:val="0"/>
+          <w:i/>
+          <w:color w:val="A0A0A0"/>
+          <w:sz w:val="20"/>
+        </w:rPr>
+        <w:t>[Image not found: 03_calibration_screen.png]</w:t>
+      </w:r>
+    </w:p>
+    <w:p>
+      <w:pPr>
+        <w:spacing w:after="280" w:before="40"/>
+        <w:jc w:val="center"/>
+      </w:pPr>
+      <w:r>
+        <w:rPr>
+          <w:rFonts w:ascii="Times New Roman" w:hAnsi="Times New Roman"/>
+          <w:b w:val="0"/>
+          <w:i/>
+          <w:color w:val="646464"/>
+          <w:sz w:val="18"/>
+        </w:rPr>
+        <w:t>Figure 3 — Calibration screen: animated Muse 2 connection sequence with progress indicator.</w:t>
       </w:r>
     </w:p>
     <w:p>
@@ -208,7 +383,7 @@
           <w:i w:val="0"/>
           <w:sz w:val="24"/>
         </w:rPr>
-        <w:t>The wearable form factor — a chest-mounted LED matrix reacting to the wearer's emotional state — creates a compelling experiential proposition. The four patterns are perceptually differentiated by hue, morphology, and animation speed, enabling even casual observers to detect emotional transitions. This satisfies the criterion of perceptual distinctiveness. A notable weakness, however, is the absence of secondary feedback channels (haptic or auditory), and the wearer cannot observe their own chest panel — creating an inherent observer-wearer asymmetry that limits personal experiential depth.</w:t>
+        <w:t>The wearable form factor creates a compelling experiential proposition. The four patterns are perceptually differentiated by hue, morphology, and animation speed, enabling casual observers to detect emotional transitions. A notable weakness, however, is the absence of secondary feedback channels (haptic or auditory), and the wearer cannot observe their own chest panel -- creating an inherent observer-wearer asymmetry that limits personal experiential depth.</w:t>
       </w:r>
     </w:p>
     <w:p>
@@ -232,7 +407,25 @@
           <w:i w:val="0"/>
           <w:sz w:val="24"/>
         </w:rPr>
-        <w:t xml:space="preserve">The real-time WebSocket stream, updated at approximately 100–200 ms intervals, provides continuous feedback aligned with Norman's principle of </w:t>
+        <w:t>The Signal Lost modal (Figure 4) demonstrates considered error recovery design: it presents a numbered three-step recovery checklist with specific commands (</w:t>
+      </w:r>
+      <w:r>
+        <w:rPr>
+          <w:rFonts w:ascii="Times New Roman" w:hAnsi="Times New Roman"/>
+          <w:b w:val="0"/>
+          <w:i w:val="0"/>
+          <w:sz w:val="24"/>
+        </w:rPr>
+        <w:t>uvicorn main:app</w:t>
+      </w:r>
+      <w:r>
+        <w:rPr>
+          <w:rFonts w:ascii="Times New Roman" w:hAnsi="Times New Roman"/>
+          <w:b w:val="0"/>
+          <w:i w:val="0"/>
+          <w:sz w:val="24"/>
+        </w:rPr>
+        <w:t xml:space="preserve">), an auto-retry countdown, and a dismiss option. This aligns with Nielsen's heuristics of </w:t>
       </w:r>
       <w:r>
         <w:rPr>
@@ -241,7 +434,7 @@
           <w:i/>
           <w:sz w:val="24"/>
         </w:rPr>
-        <w:t>immediate and continuous feedback</w:t>
+        <w:t>help users recognise, diagnose, and recover from errors</w:t>
       </w:r>
       <w:r>
         <w:rPr>
@@ -250,43 +443,39 @@
           <w:i w:val="0"/>
           <w:sz w:val="24"/>
         </w:rPr>
-        <w:t xml:space="preserve"> (Norman, 2013). The </w:t>
+        <w:t>. The real-time WebSocket stream modulates LED brightness via signal_quality (0-100), coupling input confidence to output intensity. However, pattern transitions are instantaneous on emotion change. The absence of crossfade between states violates continuity principles and produces jarring visual discontinuities that undermine organic emotional narrative.</w:t>
       </w:r>
-      <w:r>
-        <w:rPr>
-          <w:rFonts w:ascii="Times New Roman" w:hAnsi="Times New Roman"/>
-          <w:b w:val="0"/>
-          <w:i w:val="0"/>
-          <w:sz w:val="24"/>
-        </w:rPr>
-        <w:t>signal_quality</w:t>
-      </w:r>
-      <w:r>
-        <w:rPr>
-          <w:rFonts w:ascii="Times New Roman" w:hAnsi="Times New Roman"/>
-          <w:b w:val="0"/>
-          <w:i w:val="0"/>
-          <w:sz w:val="24"/>
-        </w:rPr>
-        <w:t xml:space="preserve"> value (0–100 scale) directly modulates LED brightness, coupling input confidence to output intensity: low-confidence readings produce dim output, communicating system uncertainty without explicit error messaging. The idle breathing animation when no EEG data is present satisfies the </w:t>
-      </w:r>
+    </w:p>
+    <w:p>
+      <w:pPr>
+        <w:spacing w:before="160" w:after="80"/>
+        <w:jc w:val="center"/>
+      </w:pPr>
       <w:r>
         <w:rPr>
           <w:rFonts w:ascii="Times New Roman" w:hAnsi="Times New Roman"/>
           <w:b w:val="0"/>
           <w:i/>
-          <w:sz w:val="24"/>
+          <w:color w:val="A0A0A0"/>
+          <w:sz w:val="20"/>
         </w:rPr>
-        <w:t>visibility of system status</w:t>
+        <w:t>[Image not found: 04_signal_lost.png]</w:t>
       </w:r>
+    </w:p>
+    <w:p>
+      <w:pPr>
+        <w:spacing w:after="280" w:before="40"/>
+        <w:jc w:val="center"/>
+      </w:pPr>
       <w:r>
         <w:rPr>
           <w:rFonts w:ascii="Times New Roman" w:hAnsi="Times New Roman"/>
           <w:b w:val="0"/>
-          <w:i w:val="0"/>
-          <w:sz w:val="24"/>
+          <w:i/>
+          <w:color w:val="646464"/>
+          <w:sz w:val="18"/>
         </w:rPr>
-        <w:t xml:space="preserve"> heuristic, preventing misinterpretation of a static display as system failure. However, pattern transitions are instantaneous on emotion change. The absence of crossfade or morphing between states violates continuity principles and produces jarring visual discontinuities that undermine the organic emotional narrative the system intends to convey.</w:t>
+        <w:t>Figure 4 — Signal Lost modal: graceful disconnect handling with numbered recovery steps.</w:t>
       </w:r>
     </w:p>
     <w:p>
@@ -325,7 +514,7 @@
           <w:i w:val="0"/>
           <w:sz w:val="24"/>
         </w:rPr>
-        <w:t xml:space="preserve">Analysed through Activity Theory (Engeström, 1987), Sentio situates the wearer as both </w:t>
+        <w:t xml:space="preserve">Analysed through Activity Theory (Engestrom, 1987), Sentio situates the wearer as both </w:t>
       </w:r>
       <w:r>
         <w:rPr>
@@ -379,7 +568,7 @@
           <w:i w:val="0"/>
           <w:sz w:val="24"/>
         </w:rPr>
-        <w:t>. This framing reveals a fundamental tension: the output medium (a chest panel) is most visible to external observers, not the wearer themselves. This inversion of the subject-object relationship is unacknowledged in the interface design, creating an experiential mismatch that limits personal agency and self-reflection.</w:t>
+        <w:t>. This reveals a fundamental tension: the output medium (a chest panel) is most visible to external observers, not the wearer. This inversion of the subject-object relationship is unacknowledged in the interface design, creating an experiential mismatch that limits personal agency.</w:t>
       </w:r>
     </w:p>
     <w:p>
@@ -403,7 +592,7 @@
           <w:i w:val="0"/>
           <w:sz w:val="24"/>
         </w:rPr>
-        <w:t>From a cognitive ergonomics perspective (Wickens et al., 2004), Sentio effectively minimises operator mental workload during the monitoring phase — no active control is required once streaming begins. However, the configuration stage introduces unnecessary cognitive load by requiring mandatory demographic inputs (age, gender) without providing sensible defaults, violating the principle of minimising memory burden and disrupting flow in exhibition contexts requiring rapid deployment.</w:t>
+        <w:t>The monitoring dashboard (Figure 5) presents EEG band powers, signal quality, visual parameters, and a guidance panel simultaneously. From a cognitive ergonomics perspective (Wickens et al., 2004), this density serves operator needs but risks overwhelming novice users in exhibition contexts. The AUTO/MANUAL toggle and band-specific percentage values (Alpha 9.2%, Beta 23.4%, etc.) demand EEG literacy that cannot be assumed from a general audience, violating the principle of minimising unnecessary memory burden.</w:t>
       </w:r>
     </w:p>
     <w:p>
@@ -427,7 +616,7 @@
           <w:i w:val="0"/>
           <w:sz w:val="24"/>
         </w:rPr>
-        <w:t>Hutchins' (1995) framework of distributed cognition provides the strongest theoretical justification for Sentio's value: the system externalises an invisible internal state — emotion — into a shared, perceptible artefact. However, the five-emotion discrete classification model imposes a reductive taxonomy onto a continuous neurological spectrum. Misclassification — a stressed signal rendered as focused — breaks the perceived authenticity central to the system's meaning, and the rule-based classifier offers no mechanism for individual calibration or adaptive learning.</w:t>
+        <w:t>Hutchins' (1995) framework provides the strongest theoretical justification for Sentio's value: the system externalises an invisible internal state into a shared, perceptible artefact. However, the five-emotion discrete classification model imposes a reductive taxonomy onto a continuous neurological spectrum. The rule-based classifier offers no mechanism for individual calibration or adaptive learning, and misclassification breaks the perceived authenticity central to the system's meaning.</w:t>
       </w:r>
     </w:p>
     <w:p>
@@ -451,7 +640,39 @@
           <w:i w:val="0"/>
           <w:sz w:val="24"/>
         </w:rPr>
-        <w:t>Bluetooth dropout causes EEG loss → the backend emits only heartbeat frames → the ESP32 falls back to an idle pattern → observers perceive the garment as inactive. This cascade is handled gracefully in code but is experienced externally as the system 'switching off', with no causal indication visible to observers or the wearer.</w:t>
+        <w:t>Bluetooth dropout causes EEG loss -&gt; the backend emits heartbeat-only frames -&gt; the ESP32 falls back to an idle pattern -&gt; observers perceive the garment as inactive. The Signal Lost modal (Figure 4) handles this gracefully at the frontend level, but provides no equivalent notification on the LED garment itself -- a gap that would be critical in untethered performance scenarios.</w:t>
+      </w:r>
+    </w:p>
+    <w:p>
+      <w:pPr>
+        <w:spacing w:before="160" w:after="80"/>
+        <w:jc w:val="center"/>
+      </w:pPr>
+      <w:r>
+        <w:rPr>
+          <w:rFonts w:ascii="Times New Roman" w:hAnsi="Times New Roman"/>
+          <w:b w:val="0"/>
+          <w:i/>
+          <w:color w:val="A0A0A0"/>
+          <w:sz w:val="20"/>
+        </w:rPr>
+        <w:t>[Image not found: 05_monitoring_screen.png]</w:t>
+      </w:r>
+    </w:p>
+    <w:p>
+      <w:pPr>
+        <w:spacing w:after="280" w:before="40"/>
+        <w:jc w:val="center"/>
+      </w:pPr>
+      <w:r>
+        <w:rPr>
+          <w:rFonts w:ascii="Times New Roman" w:hAnsi="Times New Roman"/>
+          <w:b w:val="0"/>
+          <w:i/>
+          <w:color w:val="646464"/>
+          <w:sz w:val="18"/>
+        </w:rPr>
+        <w:t>Figure 5 — Live Monitoring dashboard: emotion orb, real-time EEG band power chart, visual parameters panel.</w:t>
       </w:r>
     </w:p>
     <w:p>
@@ -481,7 +702,7 @@
           <w:i w:val="0"/>
           <w:sz w:val="24"/>
         </w:rPr>
-        <w:t>Sentio targets an exhibition or performance context, implying novice users with no EEG literacy. The automated calibration and guided sequential flow align with Nielsen's error prevention heuristic by removing technical complexity from user control. The emotion-to-pattern mapping applies established colour-emotion associations — red/pulse for stress, cyan/wave for calm (Kaya &amp; Epps, 2004) — reinforcing intuitive readability without prior instruction.</w:t>
+        <w:t>Sentio targets an exhibition or performance context, implying novice users with no EEG literacy. The automated calibration and guided sequential flow align with Nielsen's error prevention heuristic by removing technical complexity from user control. The emotion-to-pattern mapping applies established colour-emotion associations -- red/pulse for stress, cyan/wave for calm (Kaya &amp; Epps, 2004) -- reinforcing intuitive readability without prior instruction.</w:t>
       </w:r>
     </w:p>
     <w:p>
@@ -496,7 +717,7 @@
           <w:i w:val="0"/>
           <w:sz w:val="24"/>
         </w:rPr>
-        <w:t>The real-time monitoring interface displays EEG band powers (alpha, beta, theta, gamma, delta), signal quality, and a detected emotion label with confidence score. This design decision supports Nielsen's heuristic of visibility of system status by externalising all pipeline data for the operator. However, this transparency creates a secondary usability concern: presenting raw band power values to novice users in an exhibition context risks cognitive overload through information irrelevant to the wearer's immediate goal of experiencing the LED output. Progressive disclosure — hiding technical metrics unless explicitly requested — would better serve this user profile.</w:t>
+        <w:t>The monitoring dashboard (Figure 5) exposes all pipeline data simultaneously: band powers, signal quality, visual parameters, an AI guidance panel, and a TouchDesigner status pane. While this transparency satisfies Nielsen's visibility of system status heuristic for expert operators, the information density risks cognitive overload for the intended exhibition audience. Progressive disclosure -- hiding technical metrics unless explicitly requested -- would better serve this user profile.</w:t>
       </w:r>
     </w:p>
     <w:p>
@@ -511,7 +732,7 @@
           <w:i w:val="0"/>
           <w:sz w:val="24"/>
         </w:rPr>
-        <w:t>The manual override mode, which permits direct OSC parameter injection without EEG data, demonstrates awareness of operator needs in rehearsal or fault scenarios. This supports the heuristic of user control and freedom (Nielsen, 1994) by providing an escape route when the primary input channel fails. However, the mode is accessible only through the monitoring interface, requiring a prior successful session start — a constraint that limits its utility as a fallback during hardware failure.</w:t>
+        <w:t>The manual override mode demonstrates awareness of operator needs in rehearsal or fault scenarios, supporting Nielsen's heuristic of user control and freedom (Nielsen, 1994). However, the mode is accessible only through the monitoring interface, requiring a prior successful session start -- limiting its utility precisely when hardware failure occurs.</w:t>
       </w:r>
     </w:p>
     <w:p>
@@ -541,7 +762,7 @@
           <w:i w:val="0"/>
           <w:sz w:val="24"/>
         </w:rPr>
-        <w:t>Sentio demonstrates technical and experiential feasibility in translating EEG data to a wearable LED display. Its sequential interaction flow, signal-quality-driven brightness, and perceptually distinct patterns constitute a coherent interactive system with clear exhibition value. Critical weaknesses — calibration feedback opacity, the wearer-as-non-observer paradox, discrete emotion classification, and instantaneous pattern transitions — reduce experiential authenticity and limit usability under real-world deployment conditions.</w:t>
+        <w:t>Sentio demonstrates technical and experiential feasibility in translating EEG data to a wearable LED display. Its sequential interaction flow, signal-quality-driven brightness, perceptually distinct patterns, and well-designed error recovery (Figure 4) constitute a coherent interactive system with clear exhibition value. Critical weaknesses -- calibration feedback opacity, the wearer-as-non-observer paradox, discrete emotion classification, instantaneous pattern transitions, and dashboard information overload -- reduce experiential authenticity and limit usability under real-world deployment conditions.</w:t>
       </w:r>
     </w:p>
     <w:p>
@@ -580,7 +801,7 @@
           <w:color w:val="828282"/>
           <w:sz w:val="20"/>
         </w:rPr>
-        <w:t>Word count: approximately 870 words (excluding references).</w:t>
+        <w:t>Word count: approximately 870 words (body text, excluding captions and references).</w:t>
       </w:r>
     </w:p>
     <w:p>
@@ -610,7 +831,7 @@
           <w:i w:val="0"/>
           <w:sz w:val="22"/>
         </w:rPr>
-        <w:t>Engeström, Y. (1987). Learning by Expanding: An Activity-Theoretical Approach to Developmental Research. Orienta-Konsultit.</w:t>
+        <w:t>Engestrom, Y. (1987). Learning by Expanding: An Activity-Theoretical Approach to Developmental Research. Orienta-Konsultit.</w:t>
       </w:r>
     </w:p>
     <w:p>
@@ -640,7 +861,7 @@
           <w:i w:val="0"/>
           <w:sz w:val="22"/>
         </w:rPr>
-        <w:t>Kaya, N., &amp; Epps, H. H. (2004). Relationship between colour and emotion: A study of college students. College Student Journal, 38(3), 396–405.</w:t>
+        <w:t>Kaya, N., &amp; Epps, H. H. (2004). Relationship between colour and emotion: A study of college students. College Student Journal, 38(3), 396-405.</w:t>
       </w:r>
     </w:p>
     <w:p>

</xml_diff>

<commit_message>
Improve report with Assembly Manual hardware specs
- Update matrix to 10×20 / 200 LEDs / 40×55 cm throughout
- Add Hardware Specification Summary table (15-row spec sheet)
- Add power injection (4-point), brightness cap (50-100/255), diffusion layer
- Add Assembly Manual as reference #7
- Integrate hardware-specific critiques in every section

Co-Authored-By: Claude Sonnet 4.6 <noreply@anthropic.com>
</commit_message>
<xml_diff>
--- a/docs/sentio_critical_report.docx
+++ b/docs/sentio_critical_report.docx
@@ -49,6 +49,604 @@
         </w:rPr>
         <w:t>Sentio Project  |  WS2812B Arduino Version  |  2026</w:t>
       </w:r>
+    </w:p>
+    <w:p>
+      <w:pPr>
+        <w:spacing w:after="40" w:before="40"/>
+        <w:pBdr>
+          <w:bottom w:val="single" w:sz="6" w:space="1" w:color="AAAAAA"/>
+        </w:pBdr>
+      </w:pPr>
+    </w:p>
+    <w:p>
+      <w:pPr>
+        <w:keepNext/>
+        <w:spacing w:before="360" w:after="80"/>
+      </w:pPr>
+      <w:r>
+        <w:rPr>
+          <w:rFonts w:ascii="Times New Roman" w:hAnsi="Times New Roman"/>
+          <w:b/>
+          <w:i w:val="0"/>
+          <w:sz w:val="26"/>
+        </w:rPr>
+        <w:t>Hardware Specification Summary</w:t>
+      </w:r>
+    </w:p>
+    <w:p>
+      <w:pPr>
+        <w:spacing w:after="160"/>
+        <w:jc w:val="both"/>
+      </w:pPr>
+      <w:r>
+        <w:rPr>
+          <w:rFonts w:ascii="Times New Roman" w:hAnsi="Times New Roman"/>
+          <w:b w:val="0"/>
+          <w:i w:val="0"/>
+          <w:sz w:val="24"/>
+        </w:rPr>
+        <w:t>The physical LED garment is built according to the WS2812B LED T-Shirt Technical Documentation &amp; Assembly Manual. Key parameters are summarised below and referenced throughout this report.</w:t>
+      </w:r>
+    </w:p>
+    <w:tbl>
+      <w:tblPr>
+        <w:tblStyle w:val="TableGrid"/>
+        <w:tblW w:type="auto" w:w="0"/>
+        <w:tblLook w:firstColumn="1" w:firstRow="1" w:lastColumn="0" w:lastRow="0" w:noHBand="0" w:noVBand="1" w:val="04A0"/>
+      </w:tblPr>
+      <w:tblGrid>
+        <w:gridCol w:w="4561"/>
+        <w:gridCol w:w="4561"/>
+      </w:tblGrid>
+      <w:tr>
+        <w:tc>
+          <w:tcPr>
+            <w:tcW w:type="dxa" w:w="4561"/>
+          </w:tcPr>
+          <w:p>
+            <w:r>
+              <w:rPr>
+                <w:rFonts w:ascii="Times New Roman" w:hAnsi="Times New Roman"/>
+                <w:b/>
+                <w:i w:val="0"/>
+                <w:sz w:val="20"/>
+              </w:rPr>
+              <w:t>Parameter</w:t>
+            </w:r>
+          </w:p>
+        </w:tc>
+        <w:tc>
+          <w:tcPr>
+            <w:tcW w:type="dxa" w:w="4561"/>
+          </w:tcPr>
+          <w:p>
+            <w:r>
+              <w:rPr>
+                <w:rFonts w:ascii="Times New Roman" w:hAnsi="Times New Roman"/>
+                <w:b/>
+                <w:i w:val="0"/>
+                <w:sz w:val="20"/>
+              </w:rPr>
+              <w:t>Value</w:t>
+            </w:r>
+          </w:p>
+        </w:tc>
+      </w:tr>
+      <w:tr>
+        <w:tc>
+          <w:tcPr>
+            <w:tcW w:type="dxa" w:w="4561"/>
+          </w:tcPr>
+          <w:p>
+            <w:r>
+              <w:rPr>
+                <w:rFonts w:ascii="Times New Roman" w:hAnsi="Times New Roman"/>
+                <w:b w:val="0"/>
+                <w:i/>
+                <w:sz w:val="20"/>
+              </w:rPr>
+              <w:t>LED type</w:t>
+            </w:r>
+          </w:p>
+        </w:tc>
+        <w:tc>
+          <w:tcPr>
+            <w:tcW w:type="dxa" w:w="4561"/>
+          </w:tcPr>
+          <w:p>
+            <w:r>
+              <w:rPr>
+                <w:rFonts w:ascii="Times New Roman" w:hAnsi="Times New Roman"/>
+                <w:b w:val="0"/>
+                <w:i w:val="0"/>
+                <w:sz w:val="20"/>
+              </w:rPr>
+              <w:t>WS2812B (individually addressable RGB)</w:t>
+            </w:r>
+          </w:p>
+        </w:tc>
+      </w:tr>
+      <w:tr>
+        <w:tc>
+          <w:tcPr>
+            <w:tcW w:type="dxa" w:w="4561"/>
+          </w:tcPr>
+          <w:p>
+            <w:r>
+              <w:rPr>
+                <w:rFonts w:ascii="Times New Roman" w:hAnsi="Times New Roman"/>
+                <w:b w:val="0"/>
+                <w:i/>
+                <w:sz w:val="20"/>
+              </w:rPr>
+              <w:t>Matrix layout</w:t>
+            </w:r>
+          </w:p>
+        </w:tc>
+        <w:tc>
+          <w:tcPr>
+            <w:tcW w:type="dxa" w:w="4561"/>
+          </w:tcPr>
+          <w:p>
+            <w:r>
+              <w:rPr>
+                <w:rFonts w:ascii="Times New Roman" w:hAnsi="Times New Roman"/>
+                <w:b w:val="0"/>
+                <w:i w:val="0"/>
+                <w:sz w:val="20"/>
+              </w:rPr>
+              <w:t>10 rows x 20 columns = 200 LEDs (serpentine)</w:t>
+            </w:r>
+          </w:p>
+        </w:tc>
+      </w:tr>
+      <w:tr>
+        <w:tc>
+          <w:tcPr>
+            <w:tcW w:type="dxa" w:w="4561"/>
+          </w:tcPr>
+          <w:p>
+            <w:r>
+              <w:rPr>
+                <w:rFonts w:ascii="Times New Roman" w:hAnsi="Times New Roman"/>
+                <w:b w:val="0"/>
+                <w:i/>
+                <w:sz w:val="20"/>
+              </w:rPr>
+              <w:t>Active panel area</w:t>
+            </w:r>
+          </w:p>
+        </w:tc>
+        <w:tc>
+          <w:tcPr>
+            <w:tcW w:type="dxa" w:w="4561"/>
+          </w:tcPr>
+          <w:p>
+            <w:r>
+              <w:rPr>
+                <w:rFonts w:ascii="Times New Roman" w:hAnsi="Times New Roman"/>
+                <w:b w:val="0"/>
+                <w:i w:val="0"/>
+                <w:sz w:val="20"/>
+              </w:rPr>
+              <w:t>40 cm x 55 cm</w:t>
+            </w:r>
+          </w:p>
+        </w:tc>
+      </w:tr>
+      <w:tr>
+        <w:tc>
+          <w:tcPr>
+            <w:tcW w:type="dxa" w:w="4561"/>
+          </w:tcPr>
+          <w:p>
+            <w:r>
+              <w:rPr>
+                <w:rFonts w:ascii="Times New Roman" w:hAnsi="Times New Roman"/>
+                <w:b w:val="0"/>
+                <w:i/>
+                <w:sz w:val="20"/>
+              </w:rPr>
+              <w:t>Base panel</w:t>
+            </w:r>
+          </w:p>
+        </w:tc>
+        <w:tc>
+          <w:tcPr>
+            <w:tcW w:type="dxa" w:w="4561"/>
+          </w:tcPr>
+          <w:p>
+            <w:r>
+              <w:rPr>
+                <w:rFonts w:ascii="Times New Roman" w:hAnsi="Times New Roman"/>
+                <w:b w:val="0"/>
+                <w:i w:val="0"/>
+                <w:sz w:val="20"/>
+              </w:rPr>
+              <w:t>42 x 57 cm felt or cotton (includes margin)</w:t>
+            </w:r>
+          </w:p>
+        </w:tc>
+      </w:tr>
+      <w:tr>
+        <w:tc>
+          <w:tcPr>
+            <w:tcW w:type="dxa" w:w="4561"/>
+          </w:tcPr>
+          <w:p>
+            <w:r>
+              <w:rPr>
+                <w:rFonts w:ascii="Times New Roman" w:hAnsi="Times New Roman"/>
+                <w:b w:val="0"/>
+                <w:i/>
+                <w:sz w:val="20"/>
+              </w:rPr>
+              <w:t>Diffusion layer</w:t>
+            </w:r>
+          </w:p>
+        </w:tc>
+        <w:tc>
+          <w:tcPr>
+            <w:tcW w:type="dxa" w:w="4561"/>
+          </w:tcPr>
+          <w:p>
+            <w:r>
+              <w:rPr>
+                <w:rFonts w:ascii="Times New Roman" w:hAnsi="Times New Roman"/>
+                <w:b w:val="0"/>
+                <w:i w:val="0"/>
+                <w:sz w:val="20"/>
+              </w:rPr>
+              <w:t>Thin white fabric, lightly stitched over panel</w:t>
+            </w:r>
+          </w:p>
+        </w:tc>
+      </w:tr>
+      <w:tr>
+        <w:tc>
+          <w:tcPr>
+            <w:tcW w:type="dxa" w:w="4561"/>
+          </w:tcPr>
+          <w:p>
+            <w:r>
+              <w:rPr>
+                <w:rFonts w:ascii="Times New Roman" w:hAnsi="Times New Roman"/>
+                <w:b w:val="0"/>
+                <w:i/>
+                <w:sz w:val="20"/>
+              </w:rPr>
+              <w:t>Supply voltage</w:t>
+            </w:r>
+          </w:p>
+        </w:tc>
+        <w:tc>
+          <w:tcPr>
+            <w:tcW w:type="dxa" w:w="4561"/>
+          </w:tcPr>
+          <w:p>
+            <w:r>
+              <w:rPr>
+                <w:rFonts w:ascii="Times New Roman" w:hAnsi="Times New Roman"/>
+                <w:b w:val="0"/>
+                <w:i w:val="0"/>
+                <w:sz w:val="20"/>
+              </w:rPr>
+              <w:t>5V DC regulated</w:t>
+            </w:r>
+          </w:p>
+        </w:tc>
+      </w:tr>
+      <w:tr>
+        <w:tc>
+          <w:tcPr>
+            <w:tcW w:type="dxa" w:w="4561"/>
+          </w:tcPr>
+          <w:p>
+            <w:r>
+              <w:rPr>
+                <w:rFonts w:ascii="Times New Roman" w:hAnsi="Times New Roman"/>
+                <w:b w:val="0"/>
+                <w:i/>
+                <w:sz w:val="20"/>
+              </w:rPr>
+              <w:t>Max current (peak)</w:t>
+            </w:r>
+          </w:p>
+        </w:tc>
+        <w:tc>
+          <w:tcPr>
+            <w:tcW w:type="dxa" w:w="4561"/>
+          </w:tcPr>
+          <w:p>
+            <w:r>
+              <w:rPr>
+                <w:rFonts w:ascii="Times New Roman" w:hAnsi="Times New Roman"/>
+                <w:b w:val="0"/>
+                <w:i w:val="0"/>
+                <w:sz w:val="20"/>
+              </w:rPr>
+              <w:t>200 x 60 mA = 12 A (full white)</w:t>
+            </w:r>
+          </w:p>
+        </w:tc>
+      </w:tr>
+      <w:tr>
+        <w:tc>
+          <w:tcPr>
+            <w:tcW w:type="dxa" w:w="4561"/>
+          </w:tcPr>
+          <w:p>
+            <w:r>
+              <w:rPr>
+                <w:rFonts w:ascii="Times New Roman" w:hAnsi="Times New Roman"/>
+                <w:b w:val="0"/>
+                <w:i/>
+                <w:sz w:val="20"/>
+              </w:rPr>
+              <w:t>Recommended current</w:t>
+            </w:r>
+          </w:p>
+        </w:tc>
+        <w:tc>
+          <w:tcPr>
+            <w:tcW w:type="dxa" w:w="4561"/>
+          </w:tcPr>
+          <w:p>
+            <w:r>
+              <w:rPr>
+                <w:rFonts w:ascii="Times New Roman" w:hAnsi="Times New Roman"/>
+                <w:b w:val="0"/>
+                <w:i w:val="0"/>
+                <w:sz w:val="20"/>
+              </w:rPr>
+              <w:t>200 x 20 mA = 4 A (animated patterns)</w:t>
+            </w:r>
+          </w:p>
+        </w:tc>
+      </w:tr>
+      <w:tr>
+        <w:tc>
+          <w:tcPr>
+            <w:tcW w:type="dxa" w:w="4561"/>
+          </w:tcPr>
+          <w:p>
+            <w:r>
+              <w:rPr>
+                <w:rFonts w:ascii="Times New Roman" w:hAnsi="Times New Roman"/>
+                <w:b w:val="0"/>
+                <w:i/>
+                <w:sz w:val="20"/>
+              </w:rPr>
+              <w:t>Recommended supply</w:t>
+            </w:r>
+          </w:p>
+        </w:tc>
+        <w:tc>
+          <w:tcPr>
+            <w:tcW w:type="dxa" w:w="4561"/>
+          </w:tcPr>
+          <w:p>
+            <w:r>
+              <w:rPr>
+                <w:rFonts w:ascii="Times New Roman" w:hAnsi="Times New Roman"/>
+                <w:b w:val="0"/>
+                <w:i w:val="0"/>
+                <w:sz w:val="20"/>
+              </w:rPr>
+              <w:t>5V / 5-10 A external battery pack</w:t>
+            </w:r>
+          </w:p>
+        </w:tc>
+      </w:tr>
+      <w:tr>
+        <w:tc>
+          <w:tcPr>
+            <w:tcW w:type="dxa" w:w="4561"/>
+          </w:tcPr>
+          <w:p>
+            <w:r>
+              <w:rPr>
+                <w:rFonts w:ascii="Times New Roman" w:hAnsi="Times New Roman"/>
+                <w:b w:val="0"/>
+                <w:i/>
+                <w:sz w:val="20"/>
+              </w:rPr>
+              <w:t>Data line</w:t>
+            </w:r>
+          </w:p>
+        </w:tc>
+        <w:tc>
+          <w:tcPr>
+            <w:tcW w:type="dxa" w:w="4561"/>
+          </w:tcPr>
+          <w:p>
+            <w:r>
+              <w:rPr>
+                <w:rFonts w:ascii="Times New Roman" w:hAnsi="Times New Roman"/>
+                <w:b w:val="0"/>
+                <w:i w:val="0"/>
+                <w:sz w:val="20"/>
+              </w:rPr>
+              <w:t>Arduino/ESP32 GPIO -&gt; 330 ohm resistor -&gt; DIN</w:t>
+            </w:r>
+          </w:p>
+        </w:tc>
+      </w:tr>
+      <w:tr>
+        <w:tc>
+          <w:tcPr>
+            <w:tcW w:type="dxa" w:w="4561"/>
+          </w:tcPr>
+          <w:p>
+            <w:r>
+              <w:rPr>
+                <w:rFonts w:ascii="Times New Roman" w:hAnsi="Times New Roman"/>
+                <w:b w:val="0"/>
+                <w:i/>
+                <w:sz w:val="20"/>
+              </w:rPr>
+              <w:t>Power injection</w:t>
+            </w:r>
+          </w:p>
+        </w:tc>
+        <w:tc>
+          <w:tcPr>
+            <w:tcW w:type="dxa" w:w="4561"/>
+          </w:tcPr>
+          <w:p>
+            <w:r>
+              <w:rPr>
+                <w:rFonts w:ascii="Times New Roman" w:hAnsi="Times New Roman"/>
+                <w:b w:val="0"/>
+                <w:i w:val="0"/>
+                <w:sz w:val="20"/>
+              </w:rPr>
+              <w:t>4 points: Row 1, Row 4, Row 7, Row 10</w:t>
+            </w:r>
+          </w:p>
+        </w:tc>
+      </w:tr>
+      <w:tr>
+        <w:tc>
+          <w:tcPr>
+            <w:tcW w:type="dxa" w:w="4561"/>
+          </w:tcPr>
+          <w:p>
+            <w:r>
+              <w:rPr>
+                <w:rFonts w:ascii="Times New Roman" w:hAnsi="Times New Roman"/>
+                <w:b w:val="0"/>
+                <w:i/>
+                <w:sz w:val="20"/>
+              </w:rPr>
+              <w:t>Decoupling cap</w:t>
+            </w:r>
+          </w:p>
+        </w:tc>
+        <w:tc>
+          <w:tcPr>
+            <w:tcW w:type="dxa" w:w="4561"/>
+          </w:tcPr>
+          <w:p>
+            <w:r>
+              <w:rPr>
+                <w:rFonts w:ascii="Times New Roman" w:hAnsi="Times New Roman"/>
+                <w:b w:val="0"/>
+                <w:i w:val="0"/>
+                <w:sz w:val="20"/>
+              </w:rPr>
+              <w:t>1000 uF across 5V / GND near first LED</w:t>
+            </w:r>
+          </w:p>
+        </w:tc>
+      </w:tr>
+      <w:tr>
+        <w:tc>
+          <w:tcPr>
+            <w:tcW w:type="dxa" w:w="4561"/>
+          </w:tcPr>
+          <w:p>
+            <w:r>
+              <w:rPr>
+                <w:rFonts w:ascii="Times New Roman" w:hAnsi="Times New Roman"/>
+                <w:b w:val="0"/>
+                <w:i/>
+                <w:sz w:val="20"/>
+              </w:rPr>
+              <w:t>Wiring gauge</w:t>
+            </w:r>
+          </w:p>
+        </w:tc>
+        <w:tc>
+          <w:tcPr>
+            <w:tcW w:type="dxa" w:w="4561"/>
+          </w:tcPr>
+          <w:p>
+            <w:r>
+              <w:rPr>
+                <w:rFonts w:ascii="Times New Roman" w:hAnsi="Times New Roman"/>
+                <w:b w:val="0"/>
+                <w:i w:val="0"/>
+                <w:sz w:val="20"/>
+              </w:rPr>
+              <w:t>Silicone 22-26 AWG</w:t>
+            </w:r>
+          </w:p>
+        </w:tc>
+      </w:tr>
+      <w:tr>
+        <w:tc>
+          <w:tcPr>
+            <w:tcW w:type="dxa" w:w="4561"/>
+          </w:tcPr>
+          <w:p>
+            <w:r>
+              <w:rPr>
+                <w:rFonts w:ascii="Times New Roman" w:hAnsi="Times New Roman"/>
+                <w:b w:val="0"/>
+                <w:i/>
+                <w:sz w:val="20"/>
+              </w:rPr>
+              <w:t>Software brightness</w:t>
+            </w:r>
+          </w:p>
+        </w:tc>
+        <w:tc>
+          <w:tcPr>
+            <w:tcW w:type="dxa" w:w="4561"/>
+          </w:tcPr>
+          <w:p>
+            <w:r>
+              <w:rPr>
+                <w:rFonts w:ascii="Times New Roman" w:hAnsi="Times New Roman"/>
+                <w:b w:val="0"/>
+                <w:i w:val="0"/>
+                <w:sz w:val="20"/>
+              </w:rPr>
+              <w:t>Capped at 50-100 (out of 255) per manual</w:t>
+            </w:r>
+          </w:p>
+        </w:tc>
+      </w:tr>
+      <w:tr>
+        <w:tc>
+          <w:tcPr>
+            <w:tcW w:type="dxa" w:w="4561"/>
+          </w:tcPr>
+          <w:p>
+            <w:r>
+              <w:rPr>
+                <w:rFonts w:ascii="Times New Roman" w:hAnsi="Times New Roman"/>
+                <w:b w:val="0"/>
+                <w:i/>
+                <w:sz w:val="20"/>
+              </w:rPr>
+              <w:t>Controller</w:t>
+            </w:r>
+          </w:p>
+        </w:tc>
+        <w:tc>
+          <w:tcPr>
+            <w:tcW w:type="dxa" w:w="4561"/>
+          </w:tcPr>
+          <w:p>
+            <w:r>
+              <w:rPr>
+                <w:rFonts w:ascii="Times New Roman" w:hAnsi="Times New Roman"/>
+                <w:b w:val="0"/>
+                <w:i w:val="0"/>
+                <w:sz w:val="20"/>
+              </w:rPr>
+              <w:t>Arduino Nano or compatible (ESP32 in Sentio)</w:t>
+            </w:r>
+          </w:p>
+        </w:tc>
+      </w:tr>
+    </w:tbl>
+    <w:p>
+      <w:pPr>
+        <w:spacing w:after="160"/>
+      </w:pPr>
     </w:p>
     <w:p>
       <w:pPr>
@@ -126,7 +724,7 @@
           <w:color w:val="646464"/>
           <w:sz w:val="18"/>
         </w:rPr>
-        <w:t>Figure 0 — Sentio system architecture: Muse 2 headband to WS2812B LED matrix via ESP32 WebSocket, with React monitoring dashboard as secondary output.</w:t>
+        <w:t>Figure 0 — Sentio system architecture: Muse 2 EEG headband to 10x20 WS2812B LED matrix (200 LEDs) via ESP32 WebSocket, with React monitoring dashboard as secondary operator output.</w:t>
       </w:r>
     </w:p>
     <w:p>
@@ -164,7 +762,7 @@
           <w:i w:val="0"/>
           <w:sz w:val="24"/>
         </w:rPr>
-        <w:t>Sentio is an emotion-driven wearable interactive system that translates real-time electroencephalography (EEG) data into generative visual patterns rendered on a 16x16 WS2812B LED matrix embedded in a t-shirt. A Muse 2 headband captures brainwave activity; a Python backend classifies five emotional states -- calm, focused, stressed, relaxed, and excited -- and streams results wirelessly via WebSocket to an ESP32 microcontroller, which drives 256 individually addressable LEDs through four distinct visual patterns: Ondas Fluidas, Padrao Geometrico, Pulsos Ritmicos, and Estrelas e Particulas. The system also provides a React web dashboard (Figure 5) for real-time monitoring by operators. This report critically evaluates Sentio's effectiveness as an interactive system, examining usability, interaction design principles, and system-level thinking to assess how successfully it bridges complex neurological data and a meaningful wearable experience.</w:t>
+        <w:t>Sentio is an emotion-driven wearable interactive system that translates real-time electroencephalography (EEG) data into generative visual patterns rendered on a physical LED panel worn on a t-shirt chest. The hardware substrate -- specified in the WS2812B LED T-Shirt Assembly Manual -- comprises 200 individually addressable WS2812B LEDs arranged in a 10x20 serpentine matrix across a 40 x 55 cm active area, mounted on a 42 x 57 cm felt base panel and covered with a thin white diffusion fabric to smooth light output. A Muse 2 EEG headband streams brainwave data to a Python backend that classifies five emotional states -- calm, focused, stressed, relaxed, and excited -- and transmits results wirelessly via WebSocket to an ESP32 microcontroller driving the matrix through four visual patterns: Ondas Fluidas, Padrao Geometrico, Pulsos Ritmicos, and Estrelas e Particulas. A React web dashboard (Figure 5) provides real-time operator monitoring. This report critically evaluates Sentio's effectiveness as an interactive system, examining usability, interaction design principles, and system-level thinking to assess how successfully it bridges complex neurological data and a meaningful wearable experience.</w:t>
       </w:r>
     </w:p>
     <w:p>
@@ -180,7 +778,7 @@
           <w:color w:val="A0A0A0"/>
           <w:sz w:val="20"/>
         </w:rPr>
-        <w:t>[Image not found: 01_config_screen.png]</w:t>
+        <w:t>[Screenshot not found — save as docs/screenshots/01_config_screen.png]</w:t>
       </w:r>
     </w:p>
     <w:p>
@@ -196,7 +794,7 @@
           <w:color w:val="646464"/>
           <w:sz w:val="18"/>
         </w:rPr>
-        <w:t>Figure 1 — Configuration screen: pattern type selection and signal sensitivity slider.</w:t>
+        <w:t>Figure 1 — Configuration screen: pattern type selection (2x2 card grid) and signal sensitivity slider.</w:t>
       </w:r>
     </w:p>
     <w:p>
@@ -235,7 +833,7 @@
           <w:i w:val="0"/>
           <w:sz w:val="24"/>
         </w:rPr>
-        <w:t xml:space="preserve">Sentio achieves its primary goal through a clearly defined five-stage pipeline: session configuration, device connection, calibration, real-time monitoring, and LED pattern output (Figures 1-3). The configuration screen (Figure 1) presents pattern type as a 2x2 card grid with inline SVG previews, reducing the abstraction gap between label and output. This design decision supports task completion by providing </w:t>
+        <w:t xml:space="preserve">Sentio achieves its primary goal through a clearly defined five-stage pipeline: session configuration, device connection, calibration, real-time monitoring, and LED pattern output (Figures 1-3). The configuration screen (Figure 1) presents pattern type as a 2x2 card grid with inline SVG previews, reducing the abstraction gap between label and visual output. This decision supports task completion by providing </w:t>
       </w:r>
       <w:r>
         <w:rPr>
@@ -253,7 +851,7 @@
           <w:i w:val="0"/>
           <w:sz w:val="24"/>
         </w:rPr>
-        <w:t xml:space="preserve"> (Nielsen, 1994). However, effectiveness is contingent on hardware reliability: Bluetooth connectivity between the Muse headband and the processing machine constitutes a single point of failure capable of preventing task completion entirely.</w:t>
+        <w:t xml:space="preserve"> (Nielsen, 1994). However, hardware reliability is a critical dependency: Bluetooth connectivity between the Muse headband and the processing machine constitutes a single point of failure. Additionally, the physical garment introduces a second hardware dependency chain -- power supply integrity, 330-ohm data resistor, 1000 uF decoupling capacitor, and four power injection points -- any of which, if misconfigured, will produce partial or complete LED failure without any software-visible error.</w:t>
       </w:r>
     </w:p>
     <w:p>
@@ -277,7 +875,7 @@
           <w:i w:val="0"/>
           <w:sz w:val="24"/>
         </w:rPr>
-        <w:t xml:space="preserve">The Device Settings panel (Figure 2) allows operators to configure the backend API URL and Muse MAC address without redeploying the application -- a pragmatic field-deployment affordance. Calibration (Figure 3) completes automatically, requiring no active user input. However, efficiency is undermined by the calibration stage's opacity: the animated progress bar runs independently of actual backend processing, meaning users cannot distinguish genuine device communication from a cosmetic animation. This violates Nielsen's </w:t>
+        <w:t xml:space="preserve">The Device Settings panel (Figure 2) allows operators to configure the backend API URL and Muse MAC address in the field without redeploying the application -- a pragmatic wearable deployment affordance. Calibration (Figure 3) completes automatically, requiring no active input. However, the animated progress bar runs independently of actual backend processing, violating Nielsen's </w:t>
       </w:r>
       <w:r>
         <w:rPr>
@@ -295,7 +893,7 @@
           <w:i w:val="0"/>
           <w:sz w:val="24"/>
         </w:rPr>
-        <w:t xml:space="preserve"> heuristic and erodes trust with technically literate users.</w:t>
+        <w:t xml:space="preserve"> heuristic. The Assembly Manual recommends testing each of the 10 strip segments individually before full integration; however, Sentio provides no built-in LED diagnostic mode, requiring external test firmware and increasing pre-deployment setup time.</w:t>
       </w:r>
     </w:p>
     <w:p>
@@ -311,7 +909,7 @@
           <w:color w:val="A0A0A0"/>
           <w:sz w:val="20"/>
         </w:rPr>
-        <w:t>[Image not found: 02_device_settings.png]</w:t>
+        <w:t>[Screenshot not found — save as docs/screenshots/02_device_settings.png]</w:t>
       </w:r>
     </w:p>
     <w:p>
@@ -327,7 +925,7 @@
           <w:color w:val="646464"/>
           <w:sz w:val="18"/>
         </w:rPr>
-        <w:t>Figure 2 — Device Settings panel: backend API URL and Muse 2 MAC address configuration.</w:t>
+        <w:t>Figure 2 — Device Settings panel: backend API URL and Muse 2 MAC address configuration without redeployment.</w:t>
       </w:r>
     </w:p>
     <w:p>
@@ -343,7 +941,7 @@
           <w:color w:val="A0A0A0"/>
           <w:sz w:val="20"/>
         </w:rPr>
-        <w:t>[Image not found: 03_calibration_screen.png]</w:t>
+        <w:t>[Screenshot not found — save as docs/screenshots/03_calibration_screen.png]</w:t>
       </w:r>
     </w:p>
     <w:p>
@@ -359,7 +957,7 @@
           <w:color w:val="646464"/>
           <w:sz w:val="18"/>
         </w:rPr>
-        <w:t>Figure 3 — Calibration screen: animated Muse 2 connection sequence with progress indicator.</w:t>
+        <w:t>Figure 3 — Calibration screen: animated Muse 2 Headband connection sequence with step-by-step progress indicator.</w:t>
       </w:r>
     </w:p>
     <w:p>
@@ -383,7 +981,7 @@
           <w:i w:val="0"/>
           <w:sz w:val="24"/>
         </w:rPr>
-        <w:t>The wearable form factor creates a compelling experiential proposition. The four patterns are perceptually differentiated by hue, morphology, and animation speed, enabling casual observers to detect emotional transitions. A notable weakness, however, is the absence of secondary feedback channels (haptic or auditory), and the wearer cannot observe their own chest panel -- creating an inherent observer-wearer asymmetry that limits personal experiential depth.</w:t>
+        <w:t>The wearable form factor -- a 40 x 55 cm illuminated chest panel covered by a diffusion layer -- creates a compelling experiential proposition visible to surrounding observers. The diffusion fabric specified in the Assembly Manual smooths individual LED hotspots into a continuous colour field, improving perceived quality at the cost of some pattern resolution. The four patterns are perceptually differentiated by hue, morphology, and animation speed. A significant satisfaction weakness, however, is the observer-wearer asymmetry: the output medium faces outward, and the wearer has no direct channel -- haptic, auditory, or visual -- through which to perceive their own emotional output, limiting personal experiential engagement.</w:t>
       </w:r>
     </w:p>
     <w:p>
@@ -407,25 +1005,7 @@
           <w:i w:val="0"/>
           <w:sz w:val="24"/>
         </w:rPr>
-        <w:t>The Signal Lost modal (Figure 4) demonstrates considered error recovery design: it presents a numbered three-step recovery checklist with specific commands (</w:t>
-      </w:r>
-      <w:r>
-        <w:rPr>
-          <w:rFonts w:ascii="Times New Roman" w:hAnsi="Times New Roman"/>
-          <w:b w:val="0"/>
-          <w:i w:val="0"/>
-          <w:sz w:val="24"/>
-        </w:rPr>
-        <w:t>uvicorn main:app</w:t>
-      </w:r>
-      <w:r>
-        <w:rPr>
-          <w:rFonts w:ascii="Times New Roman" w:hAnsi="Times New Roman"/>
-          <w:b w:val="0"/>
-          <w:i w:val="0"/>
-          <w:sz w:val="24"/>
-        </w:rPr>
-        <w:t xml:space="preserve">), an auto-retry countdown, and a dismiss option. This aligns with Nielsen's heuristics of </w:t>
+        <w:t xml:space="preserve">The Signal Lost modal (Figure 4) demonstrates considered error recovery: it presents a numbered three-step checklist with specific recovery commands, an auto-retry countdown, and a dismiss option, satisfying Nielsen's heuristic of </w:t>
       </w:r>
       <w:r>
         <w:rPr>
@@ -443,7 +1023,25 @@
           <w:i w:val="0"/>
           <w:sz w:val="24"/>
         </w:rPr>
-        <w:t>. The real-time WebSocket stream modulates LED brightness via signal_quality (0-100), coupling input confidence to output intensity. However, pattern transitions are instantaneous on emotion change. The absence of crossfade between states violates continuity principles and produces jarring visual discontinuities that undermine organic emotional narrative.</w:t>
+        <w:t xml:space="preserve">. The signal_quality metric (0-100 scale) modulates LED brightness in software, with the Assembly Manual recommending a hard cap of 50-100 (out of 255) to limit power draw to the safe 4 A operating envelope. This coupling of EEG confidence to physical output intensity creates an intuitive transparency: poor signal produces a dim garment, communicating system uncertainty without explicit error messaging. However, pattern transitions remain instantaneous on emotion change. The absence of morphing between states violates </w:t>
+      </w:r>
+      <w:r>
+        <w:rPr>
+          <w:rFonts w:ascii="Times New Roman" w:hAnsi="Times New Roman"/>
+          <w:b w:val="0"/>
+          <w:i/>
+          <w:sz w:val="24"/>
+        </w:rPr>
+        <w:t>smooth continuity</w:t>
+      </w:r>
+      <w:r>
+        <w:rPr>
+          <w:rFonts w:ascii="Times New Roman" w:hAnsi="Times New Roman"/>
+          <w:b w:val="0"/>
+          <w:i w:val="0"/>
+          <w:sz w:val="24"/>
+        </w:rPr>
+        <w:t xml:space="preserve"> principles and produces jarring visual discontinuities that undermine the organic emotional narrative the system intends to convey.</w:t>
       </w:r>
     </w:p>
     <w:p>
@@ -459,7 +1057,7 @@
           <w:color w:val="A0A0A0"/>
           <w:sz w:val="20"/>
         </w:rPr>
-        <w:t>[Image not found: 04_signal_lost.png]</w:t>
+        <w:t>[Screenshot not found — save as docs/screenshots/04_signal_lost.png]</w:t>
       </w:r>
     </w:p>
     <w:p>
@@ -475,7 +1073,7 @@
           <w:color w:val="646464"/>
           <w:sz w:val="18"/>
         </w:rPr>
-        <w:t>Figure 4 — Signal Lost modal: graceful disconnect handling with numbered recovery steps.</w:t>
+        <w:t>Figure 4 — Signal Lost modal: graceful Bluetooth disconnect handling with numbered recovery checklist and auto-retry countdown.</w:t>
       </w:r>
     </w:p>
     <w:p>
@@ -532,7 +1130,7 @@
           <w:i w:val="0"/>
           <w:sz w:val="24"/>
         </w:rPr>
-        <w:t xml:space="preserve"> and primary data source, employing the EEG-to-LED pipeline as </w:t>
+        <w:t xml:space="preserve"> and primary data source, employing the full EEG-to-LED pipeline as </w:t>
       </w:r>
       <w:r>
         <w:rPr>
@@ -568,7 +1166,7 @@
           <w:i w:val="0"/>
           <w:sz w:val="24"/>
         </w:rPr>
-        <w:t>. This reveals a fundamental tension: the output medium (a chest panel) is most visible to external observers, not the wearer. This inversion of the subject-object relationship is unacknowledged in the interface design, creating an experiential mismatch that limits personal agency.</w:t>
+        <w:t>. A fundamental tension emerges: the output medium faces outward, most visible to external observers rather than the wearer. This inversion of the subject-object relationship is unacknowledged in the interface design, creating an experiential mismatch that limits personal agency and introspective utility.</w:t>
       </w:r>
     </w:p>
     <w:p>
@@ -592,7 +1190,7 @@
           <w:i w:val="0"/>
           <w:sz w:val="24"/>
         </w:rPr>
-        <w:t>The monitoring dashboard (Figure 5) presents EEG band powers, signal quality, visual parameters, and a guidance panel simultaneously. From a cognitive ergonomics perspective (Wickens et al., 2004), this density serves operator needs but risks overwhelming novice users in exhibition contexts. The AUTO/MANUAL toggle and band-specific percentage values (Alpha 9.2%, Beta 23.4%, etc.) demand EEG literacy that cannot be assumed from a general audience, violating the principle of minimising unnecessary memory burden.</w:t>
+        <w:t>The monitoring dashboard (Figure 5) presents EEG band powers, signal quality, visual parameters, and an AI Guidance panel simultaneously. From a cognitive ergonomics perspective (Wickens et al., 2004), this density serves expert operators but risks overloading novice exhibition users. The physical garment introduces additional operator cognitive load: the Assembly Manual specifies a seven-step testing procedure (individual segment test, full chain test, 30% brightness test, check for flickering, colour errors, and dead pixels) before mounting -- a process requiring technical competence not accounted for in the interaction design. The absence of a software-driven hardware diagnostic mode transfers this cognitive burden entirely to the fabrication team.</w:t>
       </w:r>
     </w:p>
     <w:p>
@@ -616,7 +1214,7 @@
           <w:i w:val="0"/>
           <w:sz w:val="24"/>
         </w:rPr>
-        <w:t>Hutchins' (1995) framework provides the strongest theoretical justification for Sentio's value: the system externalises an invisible internal state into a shared, perceptible artefact. However, the five-emotion discrete classification model imposes a reductive taxonomy onto a continuous neurological spectrum. The rule-based classifier offers no mechanism for individual calibration or adaptive learning, and misclassification breaks the perceived authenticity central to the system's meaning.</w:t>
+        <w:t>Hutchins' (1995) framework provides the strongest theoretical justification for Sentio's value: the system externalises an invisible internal emotional state into a shared, perceptible artefact worn on the body. The diffusion layer -- thin white fabric stitched over the 200-LED panel -- physically mediates this externalisation, transforming discrete pixel data into a continuous colour field legible to observers without EEG literacy. However, the five-emotion discrete classification model imposes a reductive taxonomy onto a continuous neurological spectrum, and misclassification -- a stressed signal rendered as focused -- breaks the perceived authenticity central to the garment's meaning. The rule-based classifier offers no individual calibration mechanism.</w:t>
       </w:r>
     </w:p>
     <w:p>
@@ -640,7 +1238,7 @@
           <w:i w:val="0"/>
           <w:sz w:val="24"/>
         </w:rPr>
-        <w:t>Bluetooth dropout causes EEG loss -&gt; the backend emits heartbeat-only frames -&gt; the ESP32 falls back to an idle pattern -&gt; observers perceive the garment as inactive. The Signal Lost modal (Figure 4) handles this gracefully at the frontend level, but provides no equivalent notification on the LED garment itself -- a gap that would be critical in untethered performance scenarios.</w:t>
+        <w:t>Sentio's multi-layer hardware stack creates compounded failure risk. At the software level: Bluetooth dropout stops EEG data -&gt; backend emits heartbeat-only frames -&gt; ESP32 falls back to idle animation -&gt; garment dims. At the hardware level: insufficient power supply (below the recommended 5V / 5A minimum) causes voltage sag across the 200-LED chain, producing colour distortion and flickering even when the software pipeline is fully functional. The Assembly Manual's recommendation to inject power at four points (Rows 1, 4, 7, 10) mitigates voltage drop across the serpentine chain, but this requirement is invisible to the software interface -- a missed opportunity for hardware-software status integration.</w:t>
       </w:r>
     </w:p>
     <w:p>
@@ -656,7 +1254,7 @@
           <w:color w:val="A0A0A0"/>
           <w:sz w:val="20"/>
         </w:rPr>
-        <w:t>[Image not found: 05_monitoring_screen.png]</w:t>
+        <w:t>[Screenshot not found — save as docs/screenshots/05_monitoring_screen.png]</w:t>
       </w:r>
     </w:p>
     <w:p>
@@ -672,7 +1270,7 @@
           <w:color w:val="646464"/>
           <w:sz w:val="18"/>
         </w:rPr>
-        <w:t>Figure 5 — Live Monitoring dashboard: emotion orb, real-time EEG band power chart, visual parameters panel.</w:t>
+        <w:t>Figure 5 — Live Monitoring dashboard: emotion orb, real-time EEG band power chart, Visual Parameters panel, and AI Guidance pane.</w:t>
       </w:r>
     </w:p>
     <w:p>
@@ -702,7 +1300,7 @@
           <w:i w:val="0"/>
           <w:sz w:val="24"/>
         </w:rPr>
-        <w:t>Sentio targets an exhibition or performance context, implying novice users with no EEG literacy. The automated calibration and guided sequential flow align with Nielsen's error prevention heuristic by removing technical complexity from user control. The emotion-to-pattern mapping applies established colour-emotion associations -- red/pulse for stress, cyan/wave for calm (Kaya &amp; Epps, 2004) -- reinforcing intuitive readability without prior instruction.</w:t>
+        <w:t>Sentio targets an exhibition or live performance context with novice users who have no EEG literacy. The automated calibration, guided sequential flow, and pattern type cards (Figure 1) align with Nielsen's error prevention heuristic by removing technical complexity from user control. The emotion-to-pattern colour mapping -- red/pulse for stressed, cyan/wave for calm -- applies established colour-emotion associations (Kaya &amp; Epps, 2004), reinforcing intuitive readability without prior instruction.</w:t>
       </w:r>
     </w:p>
     <w:p>
@@ -717,7 +1315,7 @@
           <w:i w:val="0"/>
           <w:sz w:val="24"/>
         </w:rPr>
-        <w:t>The monitoring dashboard (Figure 5) exposes all pipeline data simultaneously: band powers, signal quality, visual parameters, an AI guidance panel, and a TouchDesigner status pane. While this transparency satisfies Nielsen's visibility of system status heuristic for expert operators, the information density risks cognitive overload for the intended exhibition audience. Progressive disclosure -- hiding technical metrics unless explicitly requested -- would better serve this user profile.</w:t>
+        <w:t>The Assembly Manual's brightness cap (50-100 out of 255) has a direct interaction design consequence: at these levels the 200-LED panel operates within the safe 4 A operating envelope, but perceived luminance in brightly-lit exhibition environments may be insufficient for the patterns to read clearly at distance. This represents a tension between electrical safety constraints and the perceptual requirements of the exhibition context -- a conflict not addressed by the current software design, which applies a single global brightness value without environment-adaptive compensation.</w:t>
       </w:r>
     </w:p>
     <w:p>
@@ -732,7 +1330,7 @@
           <w:i w:val="0"/>
           <w:sz w:val="24"/>
         </w:rPr>
-        <w:t>The manual override mode demonstrates awareness of operator needs in rehearsal or fault scenarios, supporting Nielsen's heuristic of user control and freedom (Nielsen, 1994). However, the mode is accessible only through the monitoring interface, requiring a prior successful session start -- limiting its utility precisely when hardware failure occurs.</w:t>
+        <w:t>The monitoring dashboard (Figure 5) exposes band powers, signal quality, visual parameters, and a guidance panel simultaneously. While this satisfies Nielsen's visibility of system status for expert operators, the density risks cognitive overload for the exhibition audience. Progressive disclosure -- hiding technical band-power metrics unless explicitly requested -- would better serve this user profile. The manual override mode supports Nielsen's user control and freedom heuristic (Nielsen, 1994) by providing an escape route when the EEG pipeline fails, but it is accessible only after a successful session start, limiting its utility as a standalone fallback during hardware failure.</w:t>
       </w:r>
     </w:p>
     <w:p>
@@ -762,7 +1360,7 @@
           <w:i w:val="0"/>
           <w:sz w:val="24"/>
         </w:rPr>
-        <w:t>Sentio demonstrates technical and experiential feasibility in translating EEG data to a wearable LED display. Its sequential interaction flow, signal-quality-driven brightness, perceptually distinct patterns, and well-designed error recovery (Figure 4) constitute a coherent interactive system with clear exhibition value. Critical weaknesses -- calibration feedback opacity, the wearer-as-non-observer paradox, discrete emotion classification, instantaneous pattern transitions, and dashboard information overload -- reduce experiential authenticity and limit usability under real-world deployment conditions.</w:t>
+        <w:t>Sentio demonstrates technical and experiential feasibility in translating EEG data into a wearable LED garment. The physical build -- 200 WS2812B LEDs across a 40 x 55 cm serpentine matrix, diffusion-filtered and power-injected at four points -- provides a robust hardware substrate for emotion-reactive wearable display. Its sequential interaction flow, signal-quality-driven brightness, perceptually distinct patterns, and well-designed error recovery (Figure 4) constitute a coherent interactive system with clear exhibition value.</w:t>
       </w:r>
     </w:p>
     <w:p>
@@ -777,7 +1375,7 @@
           <w:i w:val="0"/>
           <w:sz w:val="24"/>
         </w:rPr>
-        <w:t>Future iterations should prioritise: (1) pattern morphing interpolation to smooth emotional transitions; (2) a secondary display or spatial audio feedback channel oriented towards the wearer; (3) replacement of the discrete five-emotion taxonomy with a continuous valence-arousal dimensional model; and (4) a user-adaptive machine-learning classifier to address individual EEG variability. These developments would move Sentio from a technically accomplished demonstrator towards a genuinely personalised and robust human-machine emotional communication system.</w:t>
+        <w:t>Critical weaknesses remain: calibration feedback opacity; the observer-wearer asymmetry; discrete emotion classification without individual calibration; instantaneous pattern transitions; dashboard information overload; the absence of a software-driven LED diagnostic mode; and a brightness-versus-visibility tension in high-ambient-light exhibition environments. Future iterations should prioritise: (1) pattern morphing interpolation for smooth emotional transitions; (2) secondary feedback for the wearer via audio or a mirrored mobile display; (3) a continuous valence-arousal model replacing discrete emotion labels; (4) a user-adaptive classifier trained on individual EEG baselines; and (5) environment-adaptive brightness scaling that respects the 4 A power envelope while compensating for ambient light conditions. These developments would move Sentio from a technically accomplished demonstrator towards a genuinely personalised and deployment-robust wearable emotional communication system.</w:t>
       </w:r>
     </w:p>
     <w:p>
@@ -801,7 +1399,7 @@
           <w:color w:val="828282"/>
           <w:sz w:val="20"/>
         </w:rPr>
-        <w:t>Word count: approximately 870 words (body text, excluding captions and references).</w:t>
+        <w:t>Word count: approximately 1000 words (body text, excluding table, captions, and references).</w:t>
       </w:r>
     </w:p>
     <w:p>
@@ -907,6 +1505,21 @@
           <w:sz w:val="22"/>
         </w:rPr>
         <w:t>Wickens, C. D., Lee, J. D., Liu, Y., &amp; Gordon-Becker, S. (2004). An Introduction to Human Factors Engineering (2nd ed.). Pearson Prentice Hall.</w:t>
+      </w:r>
+    </w:p>
+    <w:p>
+      <w:pPr>
+        <w:spacing w:after="80"/>
+        <w:ind w:left="567" w:hanging="567"/>
+      </w:pPr>
+      <w:r>
+        <w:rPr>
+          <w:rFonts w:ascii="Times New Roman" w:hAnsi="Times New Roman"/>
+          <w:b w:val="0"/>
+          <w:i w:val="0"/>
+          <w:sz w:val="22"/>
+        </w:rPr>
+        <w:t>WS2812B LED T-Shirt -- Technical Documentation &amp; Assembly Manual. (2026). Engineering &amp; Fabrication Team, Sentio Project. [Internal technical document].</w:t>
       </w:r>
     </w:p>
     <w:sectPr>

</xml_diff>

<commit_message>
Add t-shirt LED patterns photo to report (Figure 6)
- Insert led_patterns_tshirt.png as Figure 6 in Introduction
  showing all four emotion-driven patterns on the physical garment
- Update missing-image checker to include the new photo

Co-Authored-By: Claude Sonnet 4.6 <noreply@anthropic.com>
</commit_message>
<xml_diff>
--- a/docs/sentio_critical_report.docx
+++ b/docs/sentio_critical_report.docx
@@ -763,6 +763,38 @@
           <w:sz w:val="24"/>
         </w:rPr>
         <w:t>Sentio is an emotion-driven wearable interactive system that translates real-time electroencephalography (EEG) data into generative visual patterns rendered on a physical LED panel worn on a t-shirt chest. The hardware substrate -- specified in the WS2812B LED T-Shirt Assembly Manual -- comprises 200 individually addressable WS2812B LEDs arranged in a 10x20 serpentine matrix across a 40 x 55 cm active area, mounted on a 42 x 57 cm felt base panel and covered with a thin white diffusion fabric to smooth light output. A Muse 2 EEG headband streams brainwave data to a Python backend that classifies five emotional states -- calm, focused, stressed, relaxed, and excited -- and transmits results wirelessly via WebSocket to an ESP32 microcontroller driving the matrix through four visual patterns: Ondas Fluidas, Padrao Geometrico, Pulsos Ritmicos, and Estrelas e Particulas. A React web dashboard (Figure 5) provides real-time operator monitoring. This report critically evaluates Sentio's effectiveness as an interactive system, examining usability, interaction design principles, and system-level thinking to assess how successfully it bridges complex neurological data and a meaningful wearable experience.</w:t>
+      </w:r>
+    </w:p>
+    <w:p>
+      <w:pPr>
+        <w:spacing w:before="160" w:after="80"/>
+        <w:jc w:val="center"/>
+      </w:pPr>
+      <w:r>
+        <w:rPr>
+          <w:rFonts w:ascii="Times New Roman" w:hAnsi="Times New Roman"/>
+          <w:b w:val="0"/>
+          <w:i/>
+          <w:color w:val="A0A0A0"/>
+          <w:sz w:val="20"/>
+        </w:rPr>
+        <w:t>[Screenshot not found — save as docs/screenshots/led_patterns_tshirt.png]</w:t>
+      </w:r>
+    </w:p>
+    <w:p>
+      <w:pPr>
+        <w:spacing w:after="280" w:before="40"/>
+        <w:jc w:val="center"/>
+      </w:pPr>
+      <w:r>
+        <w:rPr>
+          <w:rFonts w:ascii="Times New Roman" w:hAnsi="Times New Roman"/>
+          <w:b w:val="0"/>
+          <w:i/>
+          <w:color w:val="646464"/>
+          <w:sz w:val="18"/>
+        </w:rPr>
+        <w:t>Figure 6 — The four emotion-driven LED patterns rendered on the physical WS2812B t-shirt garment (200 LEDs, 10x20 serpentine matrix, 40x55 cm active area): (1) Ondas Fluidas — calm/relaxed; (2) Padrao Geometrico — focused; (3) Pulsos Ritmicos — stressed/excited; (4) Estrelas e Particulas — neutral.</w:t>
       </w:r>
     </w:p>
     <w:p>

</xml_diff>